<commit_message>
[docs] Agregar primera parte del desarrollo
</commit_message>
<xml_diff>
--- a/Practica2_IntroIngSoft.docx
+++ b/Practica2_IntroIngSoft.docx
@@ -14,6 +14,8 @@
         <w:rPr>
           <w:b w:val="0"/>
           <w:bCs w:val="0"/>
+          <w:sz w:val="24"/>
+          <w:szCs w:val="24"/>
         </w:rPr>
       </w:pPr>
       <w:r>
@@ -21,6 +23,8 @@
           <w:b w:val="0"/>
           <w:bCs w:val="0"/>
           <w:noProof/>
+          <w:sz w:val="24"/>
+          <w:szCs w:val="24"/>
         </w:rPr>
         <w:drawing>
           <wp:inline distT="0" distB="0" distL="0" distR="0" wp14:anchorId="28D4FB29" wp14:editId="0DB41FCD">
@@ -79,83 +83,105 @@
         <w:rPr>
           <w:b w:val="0"/>
           <w:bCs w:val="0"/>
-        </w:rPr>
-      </w:pPr>
-    </w:p>
-    <w:p>
-      <w:pPr>
-        <w:pStyle w:val="h1"/>
-        <w:spacing w:line="480" w:lineRule="auto"/>
-        <w:rPr>
-          <w:b w:val="0"/>
-          <w:bCs w:val="0"/>
-        </w:rPr>
-      </w:pPr>
-      <w:r>
-        <w:rPr>
-          <w:b w:val="0"/>
-          <w:bCs w:val="0"/>
-        </w:rPr>
-        <w:t>Segunda</w:t>
-      </w:r>
-      <w:r>
-        <w:rPr>
-          <w:b w:val="0"/>
-          <w:bCs w:val="0"/>
-        </w:rPr>
-        <w:t xml:space="preserve"> Práctica</w:t>
-      </w:r>
-    </w:p>
-    <w:p>
-      <w:pPr>
-        <w:pStyle w:val="h1"/>
-        <w:spacing w:line="480" w:lineRule="auto"/>
-        <w:rPr>
-          <w:b w:val="0"/>
-          <w:bCs w:val="0"/>
-        </w:rPr>
-      </w:pPr>
-      <w:r>
-        <w:rPr>
-          <w:b w:val="0"/>
-          <w:bCs w:val="0"/>
-        </w:rPr>
-        <w:t>Control de versiones con github</w:t>
-      </w:r>
-    </w:p>
-    <w:p>
-      <w:pPr>
-        <w:pStyle w:val="h1"/>
-        <w:spacing w:line="480" w:lineRule="auto"/>
-        <w:rPr>
-          <w:b w:val="0"/>
-          <w:bCs w:val="0"/>
-        </w:rPr>
-      </w:pPr>
-    </w:p>
-    <w:p>
-      <w:pPr>
-        <w:pStyle w:val="h1"/>
-        <w:spacing w:line="480" w:lineRule="auto"/>
-        <w:rPr>
-          <w:b w:val="0"/>
-          <w:bCs w:val="0"/>
-        </w:rPr>
-      </w:pPr>
-    </w:p>
-    <w:p>
-      <w:pPr>
-        <w:pStyle w:val="h1"/>
-        <w:spacing w:line="480" w:lineRule="auto"/>
-        <w:rPr>
-          <w:b w:val="0"/>
-          <w:bCs w:val="0"/>
-        </w:rPr>
-      </w:pPr>
-      <w:r>
-        <w:rPr>
-          <w:b w:val="0"/>
-          <w:bCs w:val="0"/>
+          <w:sz w:val="24"/>
+          <w:szCs w:val="24"/>
+        </w:rPr>
+      </w:pPr>
+    </w:p>
+    <w:p>
+      <w:pPr>
+        <w:pStyle w:val="h1"/>
+        <w:spacing w:line="480" w:lineRule="auto"/>
+        <w:rPr>
+          <w:b w:val="0"/>
+          <w:bCs w:val="0"/>
+          <w:sz w:val="24"/>
+          <w:szCs w:val="24"/>
+        </w:rPr>
+      </w:pPr>
+      <w:r>
+        <w:rPr>
+          <w:b w:val="0"/>
+          <w:bCs w:val="0"/>
+          <w:sz w:val="24"/>
+          <w:szCs w:val="24"/>
+        </w:rPr>
+        <w:t>Segunda Práctica</w:t>
+      </w:r>
+    </w:p>
+    <w:p>
+      <w:pPr>
+        <w:pStyle w:val="h1"/>
+        <w:spacing w:line="480" w:lineRule="auto"/>
+        <w:rPr>
+          <w:b w:val="0"/>
+          <w:bCs w:val="0"/>
+          <w:sz w:val="24"/>
+          <w:szCs w:val="24"/>
+        </w:rPr>
+      </w:pPr>
+      <w:r>
+        <w:rPr>
+          <w:b w:val="0"/>
+          <w:bCs w:val="0"/>
+          <w:sz w:val="24"/>
+          <w:szCs w:val="24"/>
+        </w:rPr>
+        <w:t xml:space="preserve">Control de versiones con </w:t>
+      </w:r>
+      <w:proofErr w:type="spellStart"/>
+      <w:r>
+        <w:rPr>
+          <w:b w:val="0"/>
+          <w:bCs w:val="0"/>
+          <w:sz w:val="24"/>
+          <w:szCs w:val="24"/>
+        </w:rPr>
+        <w:t>github</w:t>
+      </w:r>
+      <w:proofErr w:type="spellEnd"/>
+    </w:p>
+    <w:p>
+      <w:pPr>
+        <w:pStyle w:val="h1"/>
+        <w:spacing w:line="480" w:lineRule="auto"/>
+        <w:rPr>
+          <w:b w:val="0"/>
+          <w:bCs w:val="0"/>
+          <w:sz w:val="24"/>
+          <w:szCs w:val="24"/>
+        </w:rPr>
+      </w:pPr>
+    </w:p>
+    <w:p>
+      <w:pPr>
+        <w:pStyle w:val="h1"/>
+        <w:spacing w:line="480" w:lineRule="auto"/>
+        <w:rPr>
+          <w:b w:val="0"/>
+          <w:bCs w:val="0"/>
+          <w:sz w:val="24"/>
+          <w:szCs w:val="24"/>
+        </w:rPr>
+      </w:pPr>
+    </w:p>
+    <w:p>
+      <w:pPr>
+        <w:pStyle w:val="h1"/>
+        <w:spacing w:line="480" w:lineRule="auto"/>
+        <w:rPr>
+          <w:b w:val="0"/>
+          <w:bCs w:val="0"/>
+          <w:sz w:val="24"/>
+          <w:szCs w:val="24"/>
+        </w:rPr>
+      </w:pPr>
+      <w:r>
+        <w:rPr>
+          <w:b w:val="0"/>
+          <w:bCs w:val="0"/>
+          <w:sz w:val="24"/>
+          <w:szCs w:val="24"/>
         </w:rPr>
         <w:t>Daniel Quirós Cordero</w:t>
       </w:r>
@@ -167,32 +193,40 @@
         <w:rPr>
           <w:b w:val="0"/>
           <w:bCs w:val="0"/>
-        </w:rPr>
-      </w:pPr>
-    </w:p>
-    <w:p>
-      <w:pPr>
-        <w:pStyle w:val="h1"/>
-        <w:spacing w:line="480" w:lineRule="auto"/>
-        <w:rPr>
-          <w:b w:val="0"/>
-          <w:bCs w:val="0"/>
-        </w:rPr>
-      </w:pPr>
-    </w:p>
-    <w:p>
-      <w:pPr>
-        <w:pStyle w:val="h1"/>
-        <w:spacing w:line="480" w:lineRule="auto"/>
-        <w:rPr>
-          <w:b w:val="0"/>
-          <w:bCs w:val="0"/>
-        </w:rPr>
-      </w:pPr>
-      <w:r>
-        <w:rPr>
-          <w:b w:val="0"/>
-          <w:bCs w:val="0"/>
+          <w:sz w:val="24"/>
+          <w:szCs w:val="24"/>
+        </w:rPr>
+      </w:pPr>
+    </w:p>
+    <w:p>
+      <w:pPr>
+        <w:pStyle w:val="h1"/>
+        <w:spacing w:line="480" w:lineRule="auto"/>
+        <w:rPr>
+          <w:b w:val="0"/>
+          <w:bCs w:val="0"/>
+          <w:sz w:val="24"/>
+          <w:szCs w:val="24"/>
+        </w:rPr>
+      </w:pPr>
+    </w:p>
+    <w:p>
+      <w:pPr>
+        <w:pStyle w:val="h1"/>
+        <w:spacing w:line="480" w:lineRule="auto"/>
+        <w:rPr>
+          <w:b w:val="0"/>
+          <w:bCs w:val="0"/>
+          <w:sz w:val="24"/>
+          <w:szCs w:val="24"/>
+        </w:rPr>
+      </w:pPr>
+      <w:r>
+        <w:rPr>
+          <w:b w:val="0"/>
+          <w:bCs w:val="0"/>
+          <w:sz w:val="24"/>
+          <w:szCs w:val="24"/>
         </w:rPr>
         <w:t>Universidad CENFOTEC</w:t>
       </w:r>
@@ -204,12 +238,16 @@
         <w:rPr>
           <w:b w:val="0"/>
           <w:bCs w:val="0"/>
-        </w:rPr>
-      </w:pPr>
-      <w:r>
-        <w:rPr>
-          <w:b w:val="0"/>
-          <w:bCs w:val="0"/>
+          <w:sz w:val="24"/>
+          <w:szCs w:val="24"/>
+        </w:rPr>
+      </w:pPr>
+      <w:r>
+        <w:rPr>
+          <w:b w:val="0"/>
+          <w:bCs w:val="0"/>
+          <w:sz w:val="24"/>
+          <w:szCs w:val="24"/>
         </w:rPr>
         <w:t>Introducción a la ingeniería de software</w:t>
       </w:r>
@@ -221,12 +259,16 @@
         <w:rPr>
           <w:b w:val="0"/>
           <w:bCs w:val="0"/>
-        </w:rPr>
-      </w:pPr>
-      <w:r>
-        <w:rPr>
-          <w:b w:val="0"/>
-          <w:bCs w:val="0"/>
+          <w:sz w:val="24"/>
+          <w:szCs w:val="24"/>
+        </w:rPr>
+      </w:pPr>
+      <w:r>
+        <w:rPr>
+          <w:b w:val="0"/>
+          <w:bCs w:val="0"/>
+          <w:sz w:val="24"/>
+          <w:szCs w:val="24"/>
         </w:rPr>
         <w:t>Verónica Mora Lezcano</w:t>
       </w:r>
@@ -238,19 +280,36 @@
         <w:rPr>
           <w:b w:val="0"/>
           <w:bCs w:val="0"/>
-        </w:rPr>
-      </w:pPr>
-      <w:r>
-        <w:rPr>
-          <w:b w:val="0"/>
-          <w:bCs w:val="0"/>
-        </w:rPr>
-        <w:t>13 Abr</w:t>
-      </w:r>
-      <w:r>
-        <w:rPr>
-          <w:b w:val="0"/>
-          <w:bCs w:val="0"/>
+          <w:sz w:val="24"/>
+          <w:szCs w:val="24"/>
+        </w:rPr>
+      </w:pPr>
+      <w:r>
+        <w:rPr>
+          <w:b w:val="0"/>
+          <w:bCs w:val="0"/>
+          <w:sz w:val="24"/>
+          <w:szCs w:val="24"/>
+        </w:rPr>
+        <w:t xml:space="preserve">13 </w:t>
+      </w:r>
+      <w:proofErr w:type="gramStart"/>
+      <w:r>
+        <w:rPr>
+          <w:b w:val="0"/>
+          <w:bCs w:val="0"/>
+          <w:sz w:val="24"/>
+          <w:szCs w:val="24"/>
+        </w:rPr>
+        <w:t>Abr</w:t>
+      </w:r>
+      <w:proofErr w:type="gramEnd"/>
+      <w:r>
+        <w:rPr>
+          <w:b w:val="0"/>
+          <w:bCs w:val="0"/>
+          <w:sz w:val="24"/>
+          <w:szCs w:val="24"/>
         </w:rPr>
         <w:t xml:space="preserve"> 202</w:t>
       </w:r>
@@ -258,6 +317,8 @@
         <w:rPr>
           <w:b w:val="0"/>
           <w:bCs w:val="0"/>
+          <w:sz w:val="24"/>
+          <w:szCs w:val="24"/>
         </w:rPr>
         <w:t>6</w:t>
       </w:r>
@@ -269,6 +330,513 @@
         <w:rPr>
           <w:b w:val="0"/>
           <w:bCs w:val="0"/>
+        </w:rPr>
+      </w:pPr>
+    </w:p>
+    <w:p>
+      <w:pPr>
+        <w:pStyle w:val="h1"/>
+        <w:spacing w:line="480" w:lineRule="auto"/>
+        <w:rPr>
+          <w:b w:val="0"/>
+          <w:bCs w:val="0"/>
+        </w:rPr>
+      </w:pPr>
+    </w:p>
+    <w:p>
+      <w:pPr>
+        <w:pStyle w:val="h1"/>
+        <w:spacing w:line="480" w:lineRule="auto"/>
+        <w:rPr>
+          <w:b w:val="0"/>
+          <w:bCs w:val="0"/>
+        </w:rPr>
+      </w:pPr>
+    </w:p>
+    <w:p>
+      <w:pPr>
+        <w:pStyle w:val="h1"/>
+        <w:spacing w:line="480" w:lineRule="auto"/>
+        <w:rPr>
+          <w:b w:val="0"/>
+          <w:bCs w:val="0"/>
+        </w:rPr>
+      </w:pPr>
+    </w:p>
+    <w:p>
+      <w:pPr>
+        <w:pStyle w:val="h1"/>
+        <w:spacing w:line="480" w:lineRule="auto"/>
+        <w:rPr>
+          <w:b w:val="0"/>
+          <w:bCs w:val="0"/>
+        </w:rPr>
+      </w:pPr>
+    </w:p>
+    <w:p>
+      <w:pPr>
+        <w:pStyle w:val="h1"/>
+        <w:spacing w:line="480" w:lineRule="auto"/>
+        <w:rPr>
+          <w:b w:val="0"/>
+          <w:bCs w:val="0"/>
+        </w:rPr>
+      </w:pPr>
+    </w:p>
+    <w:p>
+      <w:pPr>
+        <w:pStyle w:val="h1"/>
+        <w:spacing w:line="480" w:lineRule="auto"/>
+        <w:rPr>
+          <w:sz w:val="24"/>
+          <w:szCs w:val="24"/>
+        </w:rPr>
+      </w:pPr>
+      <w:r>
+        <w:rPr>
+          <w:sz w:val="24"/>
+          <w:szCs w:val="24"/>
+        </w:rPr>
+        <w:t xml:space="preserve">Taller </w:t>
+      </w:r>
+      <w:proofErr w:type="spellStart"/>
+      <w:r>
+        <w:rPr>
+          <w:sz w:val="24"/>
+          <w:szCs w:val="24"/>
+        </w:rPr>
+        <w:t>Github</w:t>
+      </w:r>
+      <w:proofErr w:type="spellEnd"/>
+    </w:p>
+    <w:p>
+      <w:pPr>
+        <w:pStyle w:val="h1"/>
+        <w:spacing w:line="480" w:lineRule="auto"/>
+        <w:jc w:val="left"/>
+        <w:rPr>
+          <w:sz w:val="24"/>
+          <w:szCs w:val="24"/>
+        </w:rPr>
+      </w:pPr>
+      <w:r>
+        <w:rPr>
+          <w:sz w:val="24"/>
+          <w:szCs w:val="24"/>
+        </w:rPr>
+        <w:t>Evidencia Fotográfica</w:t>
+      </w:r>
+    </w:p>
+    <w:p>
+      <w:pPr>
+        <w:pStyle w:val="h1"/>
+        <w:spacing w:line="480" w:lineRule="auto"/>
+        <w:jc w:val="left"/>
+        <w:rPr>
+          <w:i/>
+          <w:iCs/>
+          <w:sz w:val="24"/>
+          <w:szCs w:val="24"/>
+        </w:rPr>
+      </w:pPr>
+      <w:r>
+        <w:rPr>
+          <w:i/>
+          <w:iCs/>
+          <w:sz w:val="24"/>
+          <w:szCs w:val="24"/>
+        </w:rPr>
+        <w:t>Creación del repositorio</w:t>
+      </w:r>
+    </w:p>
+    <w:p>
+      <w:pPr>
+        <w:pStyle w:val="h1"/>
+        <w:spacing w:line="480" w:lineRule="auto"/>
+        <w:jc w:val="left"/>
+        <w:rPr>
+          <w:i/>
+          <w:iCs/>
+          <w:sz w:val="24"/>
+          <w:szCs w:val="24"/>
+        </w:rPr>
+      </w:pPr>
+      <w:r>
+        <w:rPr>
+          <w:i/>
+          <w:iCs/>
+          <w:noProof/>
+          <w:sz w:val="24"/>
+          <w:szCs w:val="24"/>
+        </w:rPr>
+        <w:drawing>
+          <wp:inline distT="0" distB="0" distL="0" distR="0" wp14:anchorId="0189BC85" wp14:editId="002A0CB8">
+            <wp:extent cx="5267486" cy="2961721"/>
+            <wp:effectExtent l="0" t="0" r="9525" b="0"/>
+            <wp:docPr id="318469455" name="Imagen 1"/>
+            <wp:cNvGraphicFramePr>
+              <a:graphicFrameLocks xmlns:a="http://schemas.openxmlformats.org/drawingml/2006/main" noChangeAspect="1"/>
+            </wp:cNvGraphicFramePr>
+            <a:graphic xmlns:a="http://schemas.openxmlformats.org/drawingml/2006/main">
+              <a:graphicData uri="http://schemas.openxmlformats.org/drawingml/2006/picture">
+                <pic:pic xmlns:pic="http://schemas.openxmlformats.org/drawingml/2006/picture">
+                  <pic:nvPicPr>
+                    <pic:cNvPr id="318469455" name="Imagen 318469455"/>
+                    <pic:cNvPicPr/>
+                  </pic:nvPicPr>
+                  <pic:blipFill>
+                    <a:blip r:embed="rId5" cstate="print">
+                      <a:extLst>
+                        <a:ext uri="{28A0092B-C50C-407E-A947-70E740481C1C}">
+                          <a14:useLocalDpi xmlns:a14="http://schemas.microsoft.com/office/drawing/2010/main" val="0"/>
+                        </a:ext>
+                      </a:extLst>
+                    </a:blip>
+                    <a:stretch>
+                      <a:fillRect/>
+                    </a:stretch>
+                  </pic:blipFill>
+                  <pic:spPr>
+                    <a:xfrm>
+                      <a:off x="0" y="0"/>
+                      <a:ext cx="5270793" cy="2963580"/>
+                    </a:xfrm>
+                    <a:prstGeom prst="rect">
+                      <a:avLst/>
+                    </a:prstGeom>
+                  </pic:spPr>
+                </pic:pic>
+              </a:graphicData>
+            </a:graphic>
+          </wp:inline>
+        </w:drawing>
+      </w:r>
+    </w:p>
+    <w:p>
+      <w:pPr>
+        <w:pStyle w:val="h1"/>
+        <w:spacing w:line="480" w:lineRule="auto"/>
+        <w:jc w:val="left"/>
+        <w:rPr>
+          <w:i/>
+          <w:iCs/>
+          <w:sz w:val="24"/>
+          <w:szCs w:val="24"/>
+        </w:rPr>
+      </w:pPr>
+      <w:r>
+        <w:rPr>
+          <w:i/>
+          <w:iCs/>
+          <w:sz w:val="24"/>
+          <w:szCs w:val="24"/>
+        </w:rPr>
+        <w:t>Clonar repositorio</w:t>
+      </w:r>
+    </w:p>
+    <w:p>
+      <w:pPr>
+        <w:pStyle w:val="h1"/>
+        <w:spacing w:line="480" w:lineRule="auto"/>
+        <w:jc w:val="left"/>
+        <w:rPr>
+          <w:i/>
+          <w:iCs/>
+          <w:sz w:val="24"/>
+          <w:szCs w:val="24"/>
+        </w:rPr>
+      </w:pPr>
+      <w:r>
+        <w:rPr>
+          <w:i/>
+          <w:iCs/>
+          <w:noProof/>
+          <w:sz w:val="24"/>
+          <w:szCs w:val="24"/>
+        </w:rPr>
+        <w:drawing>
+          <wp:inline distT="0" distB="0" distL="0" distR="0" wp14:anchorId="08A2A743" wp14:editId="57CA1F92">
+            <wp:extent cx="5226543" cy="2917275"/>
+            <wp:effectExtent l="0" t="0" r="0" b="0"/>
+            <wp:docPr id="1728957509" name="Imagen 2"/>
+            <wp:cNvGraphicFramePr>
+              <a:graphicFrameLocks xmlns:a="http://schemas.openxmlformats.org/drawingml/2006/main" noChangeAspect="1"/>
+            </wp:cNvGraphicFramePr>
+            <a:graphic xmlns:a="http://schemas.openxmlformats.org/drawingml/2006/main">
+              <a:graphicData uri="http://schemas.openxmlformats.org/drawingml/2006/picture">
+                <pic:pic xmlns:pic="http://schemas.openxmlformats.org/drawingml/2006/picture">
+                  <pic:nvPicPr>
+                    <pic:cNvPr id="1728957509" name="Imagen 1728957509"/>
+                    <pic:cNvPicPr/>
+                  </pic:nvPicPr>
+                  <pic:blipFill>
+                    <a:blip r:embed="rId6" cstate="print">
+                      <a:extLst>
+                        <a:ext uri="{28A0092B-C50C-407E-A947-70E740481C1C}">
+                          <a14:useLocalDpi xmlns:a14="http://schemas.microsoft.com/office/drawing/2010/main" val="0"/>
+                        </a:ext>
+                      </a:extLst>
+                    </a:blip>
+                    <a:stretch>
+                      <a:fillRect/>
+                    </a:stretch>
+                  </pic:blipFill>
+                  <pic:spPr>
+                    <a:xfrm>
+                      <a:off x="0" y="0"/>
+                      <a:ext cx="5228998" cy="2918645"/>
+                    </a:xfrm>
+                    <a:prstGeom prst="rect">
+                      <a:avLst/>
+                    </a:prstGeom>
+                  </pic:spPr>
+                </pic:pic>
+              </a:graphicData>
+            </a:graphic>
+          </wp:inline>
+        </w:drawing>
+      </w:r>
+    </w:p>
+    <w:p>
+      <w:pPr>
+        <w:pStyle w:val="h1"/>
+        <w:spacing w:line="480" w:lineRule="auto"/>
+        <w:jc w:val="left"/>
+        <w:rPr>
+          <w:i/>
+          <w:iCs/>
+          <w:sz w:val="24"/>
+          <w:szCs w:val="24"/>
+        </w:rPr>
+      </w:pPr>
+    </w:p>
+    <w:p>
+      <w:pPr>
+        <w:pStyle w:val="h1"/>
+        <w:spacing w:line="480" w:lineRule="auto"/>
+        <w:jc w:val="left"/>
+        <w:rPr>
+          <w:i/>
+          <w:iCs/>
+          <w:sz w:val="24"/>
+          <w:szCs w:val="24"/>
+        </w:rPr>
+      </w:pPr>
+      <w:r>
+        <w:rPr>
+          <w:i/>
+          <w:iCs/>
+          <w:sz w:val="24"/>
+          <w:szCs w:val="24"/>
+        </w:rPr>
+        <w:lastRenderedPageBreak/>
+        <w:t xml:space="preserve">Primer </w:t>
+      </w:r>
+      <w:proofErr w:type="spellStart"/>
+      <w:r>
+        <w:rPr>
+          <w:i/>
+          <w:iCs/>
+          <w:sz w:val="24"/>
+          <w:szCs w:val="24"/>
+        </w:rPr>
+        <w:t>commit</w:t>
+      </w:r>
+      <w:proofErr w:type="spellEnd"/>
+    </w:p>
+    <w:p>
+      <w:pPr>
+        <w:pStyle w:val="h1"/>
+        <w:spacing w:line="480" w:lineRule="auto"/>
+        <w:jc w:val="left"/>
+        <w:rPr>
+          <w:i/>
+          <w:iCs/>
+          <w:sz w:val="24"/>
+          <w:szCs w:val="24"/>
+        </w:rPr>
+      </w:pPr>
+      <w:r>
+        <w:rPr>
+          <w:i/>
+          <w:iCs/>
+          <w:noProof/>
+          <w:sz w:val="24"/>
+          <w:szCs w:val="24"/>
+        </w:rPr>
+        <w:drawing>
+          <wp:inline distT="0" distB="0" distL="0" distR="0" wp14:anchorId="4417A607" wp14:editId="1FB30364">
+            <wp:extent cx="5540505" cy="2977116"/>
+            <wp:effectExtent l="0" t="0" r="3175" b="0"/>
+            <wp:docPr id="2139788927" name="Imagen 3"/>
+            <wp:cNvGraphicFramePr>
+              <a:graphicFrameLocks xmlns:a="http://schemas.openxmlformats.org/drawingml/2006/main" noChangeAspect="1"/>
+            </wp:cNvGraphicFramePr>
+            <a:graphic xmlns:a="http://schemas.openxmlformats.org/drawingml/2006/main">
+              <a:graphicData uri="http://schemas.openxmlformats.org/drawingml/2006/picture">
+                <pic:pic xmlns:pic="http://schemas.openxmlformats.org/drawingml/2006/picture">
+                  <pic:nvPicPr>
+                    <pic:cNvPr id="2139788927" name="Imagen 2139788927"/>
+                    <pic:cNvPicPr/>
+                  </pic:nvPicPr>
+                  <pic:blipFill>
+                    <a:blip r:embed="rId7" cstate="print">
+                      <a:extLst>
+                        <a:ext uri="{28A0092B-C50C-407E-A947-70E740481C1C}">
+                          <a14:useLocalDpi xmlns:a14="http://schemas.microsoft.com/office/drawing/2010/main" val="0"/>
+                        </a:ext>
+                      </a:extLst>
+                    </a:blip>
+                    <a:stretch>
+                      <a:fillRect/>
+                    </a:stretch>
+                  </pic:blipFill>
+                  <pic:spPr>
+                    <a:xfrm>
+                      <a:off x="0" y="0"/>
+                      <a:ext cx="5543959" cy="2978972"/>
+                    </a:xfrm>
+                    <a:prstGeom prst="rect">
+                      <a:avLst/>
+                    </a:prstGeom>
+                  </pic:spPr>
+                </pic:pic>
+              </a:graphicData>
+            </a:graphic>
+          </wp:inline>
+        </w:drawing>
+      </w:r>
+    </w:p>
+    <w:p>
+      <w:pPr>
+        <w:pStyle w:val="h1"/>
+        <w:spacing w:line="480" w:lineRule="auto"/>
+        <w:jc w:val="left"/>
+        <w:rPr>
+          <w:i/>
+          <w:iCs/>
+          <w:sz w:val="24"/>
+          <w:szCs w:val="24"/>
+        </w:rPr>
+      </w:pPr>
+      <w:r>
+        <w:rPr>
+          <w:i/>
+          <w:iCs/>
+          <w:sz w:val="24"/>
+          <w:szCs w:val="24"/>
+        </w:rPr>
+        <w:t>Rama</w:t>
+      </w:r>
+      <w:r>
+        <w:rPr>
+          <w:i/>
+          <w:iCs/>
+          <w:sz w:val="24"/>
+          <w:szCs w:val="24"/>
+        </w:rPr>
+        <w:t xml:space="preserve"> Desarrollo</w:t>
+      </w:r>
+    </w:p>
+    <w:p>
+      <w:pPr>
+        <w:pStyle w:val="h1"/>
+        <w:spacing w:line="480" w:lineRule="auto"/>
+        <w:jc w:val="left"/>
+        <w:rPr>
+          <w:i/>
+          <w:iCs/>
+          <w:sz w:val="24"/>
+          <w:szCs w:val="24"/>
+        </w:rPr>
+      </w:pPr>
+      <w:r>
+        <w:rPr>
+          <w:i/>
+          <w:iCs/>
+          <w:noProof/>
+          <w:sz w:val="24"/>
+          <w:szCs w:val="24"/>
+        </w:rPr>
+        <w:drawing>
+          <wp:inline distT="0" distB="0" distL="0" distR="0" wp14:anchorId="09E24478" wp14:editId="3477D95D">
+            <wp:extent cx="5964865" cy="3633145"/>
+            <wp:effectExtent l="0" t="0" r="0" b="5715"/>
+            <wp:docPr id="1846890557" name="Imagen 4"/>
+            <wp:cNvGraphicFramePr>
+              <a:graphicFrameLocks xmlns:a="http://schemas.openxmlformats.org/drawingml/2006/main" noChangeAspect="1"/>
+            </wp:cNvGraphicFramePr>
+            <a:graphic xmlns:a="http://schemas.openxmlformats.org/drawingml/2006/main">
+              <a:graphicData uri="http://schemas.openxmlformats.org/drawingml/2006/picture">
+                <pic:pic xmlns:pic="http://schemas.openxmlformats.org/drawingml/2006/picture">
+                  <pic:nvPicPr>
+                    <pic:cNvPr id="1846890557" name="Imagen 1846890557"/>
+                    <pic:cNvPicPr/>
+                  </pic:nvPicPr>
+                  <pic:blipFill>
+                    <a:blip r:embed="rId8">
+                      <a:extLst>
+                        <a:ext uri="{28A0092B-C50C-407E-A947-70E740481C1C}">
+                          <a14:useLocalDpi xmlns:a14="http://schemas.microsoft.com/office/drawing/2010/main" val="0"/>
+                        </a:ext>
+                      </a:extLst>
+                    </a:blip>
+                    <a:stretch>
+                      <a:fillRect/>
+                    </a:stretch>
+                  </pic:blipFill>
+                  <pic:spPr>
+                    <a:xfrm>
+                      <a:off x="0" y="0"/>
+                      <a:ext cx="5984915" cy="3645357"/>
+                    </a:xfrm>
+                    <a:prstGeom prst="rect">
+                      <a:avLst/>
+                    </a:prstGeom>
+                  </pic:spPr>
+                </pic:pic>
+              </a:graphicData>
+            </a:graphic>
+          </wp:inline>
+        </w:drawing>
+      </w:r>
+    </w:p>
+    <w:p>
+      <w:pPr>
+        <w:pStyle w:val="h1"/>
+        <w:spacing w:line="480" w:lineRule="auto"/>
+        <w:jc w:val="left"/>
+        <w:rPr>
+          <w:i/>
+          <w:iCs/>
+          <w:sz w:val="24"/>
+          <w:szCs w:val="24"/>
+        </w:rPr>
+      </w:pPr>
+    </w:p>
+    <w:p>
+      <w:pPr>
+        <w:pStyle w:val="h1"/>
+        <w:spacing w:line="480" w:lineRule="auto"/>
+        <w:jc w:val="left"/>
+        <w:rPr>
+          <w:i/>
+          <w:iCs/>
+          <w:sz w:val="24"/>
+          <w:szCs w:val="24"/>
+        </w:rPr>
+      </w:pPr>
+    </w:p>
+    <w:p>
+      <w:pPr>
+        <w:pStyle w:val="h1"/>
+        <w:spacing w:line="480" w:lineRule="auto"/>
+        <w:jc w:val="left"/>
+        <w:rPr>
+          <w:i/>
+          <w:iCs/>
+          <w:sz w:val="24"/>
+          <w:szCs w:val="24"/>
         </w:rPr>
       </w:pPr>
     </w:p>

</xml_diff>

<commit_message>
[docs] Agregar conclusión y actualizar desarrollo
</commit_message>
<xml_diff>
--- a/Practica2_IntroIngSoft.docx
+++ b/Practica2_IntroIngSoft.docx
@@ -44,7 +44,7 @@
                     </pic:cNvPicPr>
                   </pic:nvPicPr>
                   <pic:blipFill>
-                    <a:blip r:embed="rId4" cstate="print">
+                    <a:blip r:embed="rId5" cstate="print">
                       <a:extLst>
                         <a:ext uri="{28A0092B-C50C-407E-A947-70E740481C1C}">
                           <a14:useLocalDpi xmlns:a14="http://schemas.microsoft.com/office/drawing/2010/main" val="0"/>
@@ -485,7 +485,7 @@
                     <pic:cNvPicPr/>
                   </pic:nvPicPr>
                   <pic:blipFill>
-                    <a:blip r:embed="rId5" cstate="print">
+                    <a:blip r:embed="rId6" cstate="print">
                       <a:extLst>
                         <a:ext uri="{28A0092B-C50C-407E-A947-70E740481C1C}">
                           <a14:useLocalDpi xmlns:a14="http://schemas.microsoft.com/office/drawing/2010/main" val="0"/>
@@ -570,7 +570,7 @@
                     <pic:cNvPicPr/>
                   </pic:nvPicPr>
                   <pic:blipFill>
-                    <a:blip r:embed="rId6" cstate="print">
+                    <a:blip r:embed="rId7" cstate="print">
                       <a:extLst>
                         <a:ext uri="{28A0092B-C50C-407E-A947-70E740481C1C}">
                           <a14:useLocalDpi xmlns:a14="http://schemas.microsoft.com/office/drawing/2010/main" val="0"/>
@@ -680,7 +680,7 @@
                     <pic:cNvPicPr/>
                   </pic:nvPicPr>
                   <pic:blipFill>
-                    <a:blip r:embed="rId7" cstate="print">
+                    <a:blip r:embed="rId8" cstate="print">
                       <a:extLst>
                         <a:ext uri="{28A0092B-C50C-407E-A947-70E740481C1C}">
                           <a14:useLocalDpi xmlns:a14="http://schemas.microsoft.com/office/drawing/2010/main" val="0"/>
@@ -774,7 +774,7 @@
                     <pic:cNvPicPr/>
                   </pic:nvPicPr>
                   <pic:blipFill>
-                    <a:blip r:embed="rId8">
+                    <a:blip r:embed="rId9">
                       <a:extLst>
                         <a:ext uri="{28A0092B-C50C-407E-A947-70E740481C1C}">
                           <a14:useLocalDpi xmlns:a14="http://schemas.microsoft.com/office/drawing/2010/main" val="0"/>
@@ -839,6 +839,786 @@
           <w:szCs w:val="24"/>
         </w:rPr>
       </w:pPr>
+      <w:r>
+        <w:rPr>
+          <w:i/>
+          <w:iCs/>
+          <w:sz w:val="24"/>
+          <w:szCs w:val="24"/>
+        </w:rPr>
+        <w:lastRenderedPageBreak/>
+        <w:t xml:space="preserve">Segundo </w:t>
+      </w:r>
+      <w:proofErr w:type="spellStart"/>
+      <w:r>
+        <w:rPr>
+          <w:i/>
+          <w:iCs/>
+          <w:sz w:val="24"/>
+          <w:szCs w:val="24"/>
+        </w:rPr>
+        <w:t>commit</w:t>
+      </w:r>
+      <w:proofErr w:type="spellEnd"/>
+      <w:r>
+        <w:rPr>
+          <w:i/>
+          <w:iCs/>
+          <w:sz w:val="24"/>
+          <w:szCs w:val="24"/>
+        </w:rPr>
+        <w:t xml:space="preserve"> </w:t>
+      </w:r>
+    </w:p>
+    <w:p>
+      <w:pPr>
+        <w:pStyle w:val="h1"/>
+        <w:spacing w:line="480" w:lineRule="auto"/>
+        <w:jc w:val="left"/>
+        <w:rPr>
+          <w:i/>
+          <w:iCs/>
+          <w:sz w:val="24"/>
+          <w:szCs w:val="24"/>
+        </w:rPr>
+      </w:pPr>
+      <w:r>
+        <w:rPr>
+          <w:i/>
+          <w:iCs/>
+          <w:noProof/>
+          <w:sz w:val="24"/>
+          <w:szCs w:val="24"/>
+        </w:rPr>
+        <w:drawing>
+          <wp:inline distT="0" distB="0" distL="0" distR="0" wp14:anchorId="4AA73D0D" wp14:editId="3C46C410">
+            <wp:extent cx="5717858" cy="1682496"/>
+            <wp:effectExtent l="0" t="0" r="0" b="0"/>
+            <wp:docPr id="204221986" name="Imagen 5"/>
+            <wp:cNvGraphicFramePr>
+              <a:graphicFrameLocks xmlns:a="http://schemas.openxmlformats.org/drawingml/2006/main" noChangeAspect="1"/>
+            </wp:cNvGraphicFramePr>
+            <a:graphic xmlns:a="http://schemas.openxmlformats.org/drawingml/2006/main">
+              <a:graphicData uri="http://schemas.openxmlformats.org/drawingml/2006/picture">
+                <pic:pic xmlns:pic="http://schemas.openxmlformats.org/drawingml/2006/picture">
+                  <pic:nvPicPr>
+                    <pic:cNvPr id="204221986" name="Imagen 204221986"/>
+                    <pic:cNvPicPr/>
+                  </pic:nvPicPr>
+                  <pic:blipFill>
+                    <a:blip r:embed="rId10">
+                      <a:extLst>
+                        <a:ext uri="{28A0092B-C50C-407E-A947-70E740481C1C}">
+                          <a14:useLocalDpi xmlns:a14="http://schemas.microsoft.com/office/drawing/2010/main" val="0"/>
+                        </a:ext>
+                      </a:extLst>
+                    </a:blip>
+                    <a:stretch>
+                      <a:fillRect/>
+                    </a:stretch>
+                  </pic:blipFill>
+                  <pic:spPr>
+                    <a:xfrm>
+                      <a:off x="0" y="0"/>
+                      <a:ext cx="5743145" cy="1689937"/>
+                    </a:xfrm>
+                    <a:prstGeom prst="rect">
+                      <a:avLst/>
+                    </a:prstGeom>
+                  </pic:spPr>
+                </pic:pic>
+              </a:graphicData>
+            </a:graphic>
+          </wp:inline>
+        </w:drawing>
+      </w:r>
+    </w:p>
+    <w:p>
+      <w:pPr>
+        <w:pStyle w:val="h1"/>
+        <w:spacing w:line="480" w:lineRule="auto"/>
+        <w:jc w:val="left"/>
+        <w:rPr>
+          <w:i/>
+          <w:iCs/>
+          <w:sz w:val="24"/>
+          <w:szCs w:val="24"/>
+        </w:rPr>
+      </w:pPr>
+    </w:p>
+    <w:p>
+      <w:pPr>
+        <w:pStyle w:val="h1"/>
+        <w:spacing w:line="480" w:lineRule="auto"/>
+        <w:jc w:val="left"/>
+        <w:rPr>
+          <w:i/>
+          <w:iCs/>
+          <w:sz w:val="24"/>
+          <w:szCs w:val="24"/>
+        </w:rPr>
+      </w:pPr>
+    </w:p>
+    <w:p>
+      <w:pPr>
+        <w:pStyle w:val="h1"/>
+        <w:spacing w:line="480" w:lineRule="auto"/>
+        <w:jc w:val="left"/>
+        <w:rPr>
+          <w:i/>
+          <w:iCs/>
+          <w:sz w:val="24"/>
+          <w:szCs w:val="24"/>
+        </w:rPr>
+      </w:pPr>
+      <w:r>
+        <w:rPr>
+          <w:i/>
+          <w:iCs/>
+          <w:sz w:val="24"/>
+          <w:szCs w:val="24"/>
+        </w:rPr>
+        <w:t>Rama Conclusión</w:t>
+      </w:r>
+    </w:p>
+    <w:p>
+      <w:pPr>
+        <w:pStyle w:val="h1"/>
+        <w:spacing w:line="480" w:lineRule="auto"/>
+        <w:jc w:val="left"/>
+        <w:rPr>
+          <w:i/>
+          <w:iCs/>
+          <w:sz w:val="24"/>
+          <w:szCs w:val="24"/>
+        </w:rPr>
+      </w:pPr>
+      <w:r>
+        <w:rPr>
+          <w:i/>
+          <w:iCs/>
+          <w:sz w:val="24"/>
+          <w:szCs w:val="24"/>
+        </w:rPr>
+        <w:drawing>
+          <wp:inline distT="0" distB="0" distL="0" distR="0" wp14:anchorId="55A6DBFD" wp14:editId="12FD8F99">
+            <wp:extent cx="5118835" cy="1180214"/>
+            <wp:effectExtent l="0" t="0" r="5715" b="1270"/>
+            <wp:docPr id="513711663" name="Imagen 1"/>
+            <wp:cNvGraphicFramePr>
+              <a:graphicFrameLocks xmlns:a="http://schemas.openxmlformats.org/drawingml/2006/main" noChangeAspect="1"/>
+            </wp:cNvGraphicFramePr>
+            <a:graphic xmlns:a="http://schemas.openxmlformats.org/drawingml/2006/main">
+              <a:graphicData uri="http://schemas.openxmlformats.org/drawingml/2006/picture">
+                <pic:pic xmlns:pic="http://schemas.openxmlformats.org/drawingml/2006/picture">
+                  <pic:nvPicPr>
+                    <pic:cNvPr id="513711663" name=""/>
+                    <pic:cNvPicPr/>
+                  </pic:nvPicPr>
+                  <pic:blipFill>
+                    <a:blip r:embed="rId11"/>
+                    <a:stretch>
+                      <a:fillRect/>
+                    </a:stretch>
+                  </pic:blipFill>
+                  <pic:spPr>
+                    <a:xfrm>
+                      <a:off x="0" y="0"/>
+                      <a:ext cx="5183658" cy="1195160"/>
+                    </a:xfrm>
+                    <a:prstGeom prst="rect">
+                      <a:avLst/>
+                    </a:prstGeom>
+                  </pic:spPr>
+                </pic:pic>
+              </a:graphicData>
+            </a:graphic>
+          </wp:inline>
+        </w:drawing>
+      </w:r>
+    </w:p>
+    <w:p>
+      <w:pPr>
+        <w:pStyle w:val="h1"/>
+        <w:spacing w:line="480" w:lineRule="auto"/>
+        <w:jc w:val="left"/>
+        <w:rPr>
+          <w:i/>
+          <w:iCs/>
+          <w:sz w:val="24"/>
+          <w:szCs w:val="24"/>
+        </w:rPr>
+      </w:pPr>
+      <w:r>
+        <w:rPr>
+          <w:i/>
+          <w:iCs/>
+          <w:sz w:val="24"/>
+          <w:szCs w:val="24"/>
+        </w:rPr>
+        <w:t xml:space="preserve">Tercer </w:t>
+      </w:r>
+      <w:proofErr w:type="spellStart"/>
+      <w:r>
+        <w:rPr>
+          <w:i/>
+          <w:iCs/>
+          <w:sz w:val="24"/>
+          <w:szCs w:val="24"/>
+        </w:rPr>
+        <w:t>commit</w:t>
+      </w:r>
+      <w:proofErr w:type="spellEnd"/>
+    </w:p>
+    <w:p>
+      <w:pPr>
+        <w:pStyle w:val="h1"/>
+        <w:spacing w:line="480" w:lineRule="auto"/>
+        <w:jc w:val="left"/>
+        <w:rPr>
+          <w:i/>
+          <w:iCs/>
+          <w:sz w:val="24"/>
+          <w:szCs w:val="24"/>
+        </w:rPr>
+      </w:pPr>
+      <w:r>
+        <w:rPr>
+          <w:i/>
+          <w:iCs/>
+          <w:noProof/>
+          <w:sz w:val="24"/>
+          <w:szCs w:val="24"/>
+        </w:rPr>
+        <w:drawing>
+          <wp:inline distT="0" distB="0" distL="0" distR="0" wp14:anchorId="3C92A1E3" wp14:editId="6E7CC0FD">
+            <wp:extent cx="5731510" cy="2986405"/>
+            <wp:effectExtent l="0" t="0" r="2540" b="4445"/>
+            <wp:docPr id="260505969" name="Imagen 6"/>
+            <wp:cNvGraphicFramePr>
+              <a:graphicFrameLocks xmlns:a="http://schemas.openxmlformats.org/drawingml/2006/main" noChangeAspect="1"/>
+            </wp:cNvGraphicFramePr>
+            <a:graphic xmlns:a="http://schemas.openxmlformats.org/drawingml/2006/main">
+              <a:graphicData uri="http://schemas.openxmlformats.org/drawingml/2006/picture">
+                <pic:pic xmlns:pic="http://schemas.openxmlformats.org/drawingml/2006/picture">
+                  <pic:nvPicPr>
+                    <pic:cNvPr id="260505969" name="Imagen 260505969"/>
+                    <pic:cNvPicPr/>
+                  </pic:nvPicPr>
+                  <pic:blipFill>
+                    <a:blip r:embed="rId12" cstate="print">
+                      <a:extLst>
+                        <a:ext uri="{28A0092B-C50C-407E-A947-70E740481C1C}">
+                          <a14:useLocalDpi xmlns:a14="http://schemas.microsoft.com/office/drawing/2010/main" val="0"/>
+                        </a:ext>
+                      </a:extLst>
+                    </a:blip>
+                    <a:stretch>
+                      <a:fillRect/>
+                    </a:stretch>
+                  </pic:blipFill>
+                  <pic:spPr>
+                    <a:xfrm>
+                      <a:off x="0" y="0"/>
+                      <a:ext cx="5731510" cy="2986405"/>
+                    </a:xfrm>
+                    <a:prstGeom prst="rect">
+                      <a:avLst/>
+                    </a:prstGeom>
+                  </pic:spPr>
+                </pic:pic>
+              </a:graphicData>
+            </a:graphic>
+          </wp:inline>
+        </w:drawing>
+      </w:r>
+    </w:p>
+    <w:p>
+      <w:pPr>
+        <w:pStyle w:val="h1"/>
+        <w:spacing w:line="480" w:lineRule="auto"/>
+        <w:jc w:val="left"/>
+        <w:rPr>
+          <w:i/>
+          <w:iCs/>
+          <w:sz w:val="24"/>
+          <w:szCs w:val="24"/>
+        </w:rPr>
+      </w:pPr>
+    </w:p>
+    <w:p>
+      <w:pPr>
+        <w:pStyle w:val="h1"/>
+        <w:spacing w:line="480" w:lineRule="auto"/>
+        <w:jc w:val="left"/>
+        <w:rPr>
+          <w:i/>
+          <w:iCs/>
+          <w:sz w:val="24"/>
+          <w:szCs w:val="24"/>
+        </w:rPr>
+      </w:pPr>
+    </w:p>
+    <w:p>
+      <w:pPr>
+        <w:pStyle w:val="h1"/>
+        <w:spacing w:line="480" w:lineRule="auto"/>
+        <w:jc w:val="left"/>
+        <w:rPr>
+          <w:i/>
+          <w:iCs/>
+          <w:sz w:val="24"/>
+          <w:szCs w:val="24"/>
+        </w:rPr>
+      </w:pPr>
+    </w:p>
+    <w:p>
+      <w:pPr>
+        <w:pStyle w:val="h1"/>
+        <w:spacing w:line="480" w:lineRule="auto"/>
+        <w:jc w:val="left"/>
+        <w:rPr>
+          <w:i/>
+          <w:iCs/>
+          <w:sz w:val="24"/>
+          <w:szCs w:val="24"/>
+        </w:rPr>
+      </w:pPr>
+    </w:p>
+    <w:p>
+      <w:pPr>
+        <w:pStyle w:val="h1"/>
+        <w:spacing w:line="480" w:lineRule="auto"/>
+        <w:jc w:val="left"/>
+        <w:rPr>
+          <w:i/>
+          <w:iCs/>
+          <w:sz w:val="24"/>
+          <w:szCs w:val="24"/>
+        </w:rPr>
+      </w:pPr>
+    </w:p>
+    <w:p>
+      <w:pPr>
+        <w:pStyle w:val="h1"/>
+        <w:spacing w:line="480" w:lineRule="auto"/>
+        <w:jc w:val="left"/>
+        <w:rPr>
+          <w:i/>
+          <w:iCs/>
+          <w:sz w:val="24"/>
+          <w:szCs w:val="24"/>
+        </w:rPr>
+      </w:pPr>
+    </w:p>
+    <w:p>
+      <w:pPr>
+        <w:pStyle w:val="h1"/>
+        <w:spacing w:line="480" w:lineRule="auto"/>
+        <w:jc w:val="left"/>
+        <w:rPr>
+          <w:i/>
+          <w:iCs/>
+          <w:sz w:val="24"/>
+          <w:szCs w:val="24"/>
+        </w:rPr>
+      </w:pPr>
+    </w:p>
+    <w:p>
+      <w:pPr>
+        <w:pStyle w:val="h1"/>
+        <w:spacing w:line="480" w:lineRule="auto"/>
+        <w:jc w:val="left"/>
+        <w:rPr>
+          <w:i/>
+          <w:iCs/>
+          <w:sz w:val="24"/>
+          <w:szCs w:val="24"/>
+        </w:rPr>
+      </w:pPr>
+    </w:p>
+    <w:p>
+      <w:pPr>
+        <w:pStyle w:val="h1"/>
+        <w:spacing w:line="480" w:lineRule="auto"/>
+        <w:jc w:val="left"/>
+        <w:rPr>
+          <w:i/>
+          <w:iCs/>
+          <w:sz w:val="24"/>
+          <w:szCs w:val="24"/>
+        </w:rPr>
+      </w:pPr>
+    </w:p>
+    <w:p>
+      <w:pPr>
+        <w:pStyle w:val="h1"/>
+        <w:spacing w:line="480" w:lineRule="auto"/>
+        <w:jc w:val="left"/>
+        <w:rPr>
+          <w:i/>
+          <w:iCs/>
+          <w:sz w:val="24"/>
+          <w:szCs w:val="24"/>
+        </w:rPr>
+      </w:pPr>
+    </w:p>
+    <w:p>
+      <w:pPr>
+        <w:pStyle w:val="h1"/>
+        <w:spacing w:line="480" w:lineRule="auto"/>
+        <w:jc w:val="left"/>
+        <w:rPr>
+          <w:i/>
+          <w:iCs/>
+          <w:sz w:val="24"/>
+          <w:szCs w:val="24"/>
+        </w:rPr>
+      </w:pPr>
+    </w:p>
+    <w:p>
+      <w:pPr>
+        <w:pStyle w:val="h1"/>
+        <w:spacing w:line="480" w:lineRule="auto"/>
+        <w:jc w:val="left"/>
+        <w:rPr>
+          <w:i/>
+          <w:iCs/>
+          <w:sz w:val="24"/>
+          <w:szCs w:val="24"/>
+        </w:rPr>
+      </w:pPr>
+    </w:p>
+    <w:p>
+      <w:pPr>
+        <w:pStyle w:val="h1"/>
+        <w:spacing w:line="480" w:lineRule="auto"/>
+        <w:jc w:val="left"/>
+        <w:rPr>
+          <w:i/>
+          <w:iCs/>
+          <w:sz w:val="24"/>
+          <w:szCs w:val="24"/>
+        </w:rPr>
+      </w:pPr>
+    </w:p>
+    <w:p>
+      <w:pPr>
+        <w:pStyle w:val="h1"/>
+        <w:spacing w:line="480" w:lineRule="auto"/>
+        <w:jc w:val="left"/>
+        <w:rPr>
+          <w:i/>
+          <w:iCs/>
+          <w:sz w:val="24"/>
+          <w:szCs w:val="24"/>
+        </w:rPr>
+      </w:pPr>
+    </w:p>
+    <w:p>
+      <w:pPr>
+        <w:pStyle w:val="h1"/>
+        <w:spacing w:line="480" w:lineRule="auto"/>
+        <w:jc w:val="left"/>
+        <w:rPr>
+          <w:i/>
+          <w:iCs/>
+          <w:sz w:val="24"/>
+          <w:szCs w:val="24"/>
+        </w:rPr>
+      </w:pPr>
+    </w:p>
+    <w:p>
+      <w:pPr>
+        <w:pStyle w:val="h1"/>
+        <w:spacing w:line="480" w:lineRule="auto"/>
+        <w:jc w:val="left"/>
+        <w:rPr>
+          <w:i/>
+          <w:iCs/>
+          <w:sz w:val="24"/>
+          <w:szCs w:val="24"/>
+        </w:rPr>
+      </w:pPr>
+    </w:p>
+    <w:p>
+      <w:pPr>
+        <w:pStyle w:val="h1"/>
+        <w:spacing w:line="480" w:lineRule="auto"/>
+        <w:rPr>
+          <w:sz w:val="24"/>
+          <w:szCs w:val="24"/>
+        </w:rPr>
+      </w:pPr>
+      <w:r>
+        <w:rPr>
+          <w:sz w:val="24"/>
+          <w:szCs w:val="24"/>
+        </w:rPr>
+        <w:t>Conclusiones</w:t>
+      </w:r>
+    </w:p>
+    <w:p>
+      <w:pPr>
+        <w:pStyle w:val="h1"/>
+        <w:spacing w:line="480" w:lineRule="auto"/>
+        <w:ind w:firstLine="708"/>
+        <w:jc w:val="left"/>
+        <w:rPr>
+          <w:b w:val="0"/>
+          <w:bCs w:val="0"/>
+        </w:rPr>
+      </w:pPr>
+      <w:r>
+        <w:rPr>
+          <w:b w:val="0"/>
+          <w:bCs w:val="0"/>
+        </w:rPr>
+        <w:t>La realización de esta práctica permitió aplicar de manera integral los fundamentos del control de versiones utilizando Git y GitHub Desktop. A través del ejercicio, se logró estructurar un flujo de trabajo basado en ramas (</w:t>
+      </w:r>
+      <w:proofErr w:type="spellStart"/>
+      <w:r>
+        <w:rPr>
+          <w:b w:val="0"/>
+          <w:bCs w:val="0"/>
+        </w:rPr>
+        <w:t>branches</w:t>
+      </w:r>
+      <w:proofErr w:type="spellEnd"/>
+      <w:r>
+        <w:rPr>
+          <w:b w:val="0"/>
+          <w:bCs w:val="0"/>
+        </w:rPr>
+        <w:t xml:space="preserve">), donde cada etapa del documento (introducción, desarrollo y conclusión) fue tratada como un módulo independiente. Este proceso facilitó la comprensión de la </w:t>
+      </w:r>
+      <w:r>
+        <w:rPr>
+          <w:b w:val="0"/>
+          <w:bCs w:val="0"/>
+        </w:rPr>
+        <w:lastRenderedPageBreak/>
+        <w:t xml:space="preserve">importancia de los </w:t>
+      </w:r>
+      <w:proofErr w:type="spellStart"/>
+      <w:r>
+        <w:rPr>
+          <w:b w:val="0"/>
+          <w:bCs w:val="0"/>
+        </w:rPr>
+        <w:t>commits</w:t>
+      </w:r>
+      <w:proofErr w:type="spellEnd"/>
+      <w:r>
+        <w:rPr>
+          <w:b w:val="0"/>
+          <w:bCs w:val="0"/>
+        </w:rPr>
+        <w:t xml:space="preserve"> como puntos de restauración y registro histórico, permitiendo que el proyecto evolucionara de forma organizada y segura.</w:t>
+      </w:r>
+    </w:p>
+    <w:p>
+      <w:pPr>
+        <w:pStyle w:val="h1"/>
+        <w:spacing w:line="480" w:lineRule="auto"/>
+        <w:jc w:val="left"/>
+        <w:rPr>
+          <w:b w:val="0"/>
+          <w:bCs w:val="0"/>
+        </w:rPr>
+      </w:pPr>
+      <w:r>
+        <w:rPr>
+          <w:b w:val="0"/>
+          <w:bCs w:val="0"/>
+        </w:rPr>
+        <w:t>Aprendizajes clave:</w:t>
+      </w:r>
+    </w:p>
+    <w:p>
+      <w:pPr>
+        <w:pStyle w:val="h1"/>
+        <w:numPr>
+          <w:ilvl w:val="0"/>
+          <w:numId w:val="1"/>
+        </w:numPr>
+        <w:spacing w:line="480" w:lineRule="auto"/>
+        <w:jc w:val="left"/>
+        <w:rPr>
+          <w:b w:val="0"/>
+          <w:bCs w:val="0"/>
+        </w:rPr>
+      </w:pPr>
+      <w:r>
+        <w:rPr>
+          <w:b w:val="0"/>
+          <w:bCs w:val="0"/>
+        </w:rPr>
+        <w:t xml:space="preserve">Gestión de Cambios: Se comprendió que el </w:t>
+      </w:r>
+      <w:proofErr w:type="spellStart"/>
+      <w:r>
+        <w:rPr>
+          <w:b w:val="0"/>
+          <w:bCs w:val="0"/>
+        </w:rPr>
+        <w:t>commit</w:t>
+      </w:r>
+      <w:proofErr w:type="spellEnd"/>
+      <w:r>
+        <w:rPr>
+          <w:b w:val="0"/>
+          <w:bCs w:val="0"/>
+        </w:rPr>
+        <w:t xml:space="preserve"> es la unidad básica de guardado en Git y que es fundamental para evitar conflictos al saltar entre diferentes versiones de un mismo archivo.</w:t>
+      </w:r>
+    </w:p>
+    <w:p>
+      <w:pPr>
+        <w:pStyle w:val="h1"/>
+        <w:numPr>
+          <w:ilvl w:val="0"/>
+          <w:numId w:val="1"/>
+        </w:numPr>
+        <w:spacing w:line="480" w:lineRule="auto"/>
+        <w:jc w:val="left"/>
+        <w:rPr>
+          <w:b w:val="0"/>
+          <w:bCs w:val="0"/>
+        </w:rPr>
+      </w:pPr>
+      <w:r>
+        <w:rPr>
+          <w:b w:val="0"/>
+          <w:bCs w:val="0"/>
+        </w:rPr>
+        <w:t>Estructura de Ramas: Se aprendió a utilizar una estrategia de ramificación para separar tareas específicas, lo cual permite trabajar en nuevas funcionalidades (o secciones de un informe) sin alterar la rama principal (</w:t>
+      </w:r>
+      <w:proofErr w:type="spellStart"/>
+      <w:r>
+        <w:rPr>
+          <w:b w:val="0"/>
+          <w:bCs w:val="0"/>
+        </w:rPr>
+        <w:t>main</w:t>
+      </w:r>
+      <w:proofErr w:type="spellEnd"/>
+      <w:r>
+        <w:rPr>
+          <w:b w:val="0"/>
+          <w:bCs w:val="0"/>
+        </w:rPr>
+        <w:t>) hasta que el contenido esté finalizado y verificado.</w:t>
+      </w:r>
+    </w:p>
+    <w:p>
+      <w:pPr>
+        <w:pStyle w:val="h1"/>
+        <w:numPr>
+          <w:ilvl w:val="0"/>
+          <w:numId w:val="1"/>
+        </w:numPr>
+        <w:spacing w:line="480" w:lineRule="auto"/>
+        <w:jc w:val="left"/>
+        <w:rPr>
+          <w:b w:val="0"/>
+          <w:bCs w:val="0"/>
+        </w:rPr>
+      </w:pPr>
+      <w:r>
+        <w:rPr>
+          <w:b w:val="0"/>
+          <w:bCs w:val="0"/>
+        </w:rPr>
+        <w:t>Integración (</w:t>
+      </w:r>
+      <w:proofErr w:type="spellStart"/>
+      <w:r>
+        <w:rPr>
+          <w:b w:val="0"/>
+          <w:bCs w:val="0"/>
+        </w:rPr>
+        <w:t>Merge</w:t>
+      </w:r>
+      <w:proofErr w:type="spellEnd"/>
+      <w:r>
+        <w:rPr>
+          <w:b w:val="0"/>
+          <w:bCs w:val="0"/>
+        </w:rPr>
+        <w:t>): Se dominó el proceso de fusión de ramas, entendiendo cómo Git consolida el trabajo realizado de forma aislada en un producto final unificado.</w:t>
+      </w:r>
+    </w:p>
+    <w:p>
+      <w:pPr>
+        <w:pStyle w:val="h1"/>
+        <w:spacing w:line="480" w:lineRule="auto"/>
+        <w:ind w:firstLine="360"/>
+        <w:jc w:val="left"/>
+        <w:rPr>
+          <w:b w:val="0"/>
+          <w:bCs w:val="0"/>
+        </w:rPr>
+      </w:pPr>
+      <w:r>
+        <w:rPr>
+          <w:b w:val="0"/>
+          <w:bCs w:val="0"/>
+        </w:rPr>
+        <w:t>En el ámbito de la Ingeniería de Software, el dominio de estas herramientas es una competencia indispensable. El control de versiones no solo garantiza la trazabilidad (saber quién, cuándo y por qué se hizo un cambio), sino que es la base del trabajo colaborativo a gran escala. En un entorno profesional, el uso correcto de ramas permite que múltiples desarrolladores trabajen en distintas partes de un sistema simultáneamente sin interferir entre sí, facilitando la implementación de metodologías ágiles y procesos de integración continua (CI/CD) que aseguran la calidad y estabilidad del software entregado.</w:t>
+      </w:r>
+    </w:p>
+    <w:p>
+      <w:pPr>
+        <w:pStyle w:val="h1"/>
+        <w:spacing w:line="480" w:lineRule="auto"/>
+        <w:jc w:val="left"/>
+        <w:rPr>
+          <w:b w:val="0"/>
+          <w:bCs w:val="0"/>
+          <w:sz w:val="24"/>
+          <w:szCs w:val="24"/>
+        </w:rPr>
+      </w:pPr>
+    </w:p>
+    <w:p>
+      <w:pPr>
+        <w:pStyle w:val="h1"/>
+        <w:spacing w:line="480" w:lineRule="auto"/>
+        <w:jc w:val="left"/>
+        <w:rPr>
+          <w:i/>
+          <w:iCs/>
+          <w:sz w:val="24"/>
+          <w:szCs w:val="24"/>
+        </w:rPr>
+      </w:pPr>
+    </w:p>
+    <w:p>
+      <w:pPr>
+        <w:pStyle w:val="h1"/>
+        <w:spacing w:line="480" w:lineRule="auto"/>
+        <w:jc w:val="left"/>
+        <w:rPr>
+          <w:i/>
+          <w:iCs/>
+          <w:sz w:val="24"/>
+          <w:szCs w:val="24"/>
+        </w:rPr>
+      </w:pPr>
+    </w:p>
+    <w:p>
+      <w:pPr>
+        <w:pStyle w:val="h1"/>
+        <w:spacing w:line="480" w:lineRule="auto"/>
+        <w:jc w:val="left"/>
+        <w:rPr>
+          <w:i/>
+          <w:iCs/>
+          <w:sz w:val="24"/>
+          <w:szCs w:val="24"/>
+        </w:rPr>
+      </w:pPr>
     </w:p>
     <w:sectPr>
       <w:pgSz w:w="11906" w:h="16838"/>
@@ -848,6 +1628,163 @@
     </w:sectPr>
   </w:body>
 </w:document>
+</file>
+
+<file path=word/numbering.xml><?xml version="1.0" encoding="utf-8"?>
+<w:numbering xmlns:wpc="http://schemas.microsoft.com/office/word/2010/wordprocessingCanvas" xmlns:cx="http://schemas.microsoft.com/office/drawing/2014/chartex" xmlns:cx1="http://schemas.microsoft.com/office/drawing/2015/9/8/chartex" xmlns:cx2="http://schemas.microsoft.com/office/drawing/2015/10/21/chartex" xmlns:cx3="http://schemas.microsoft.com/office/drawing/2016/5/9/chartex" xmlns:cx4="http://schemas.microsoft.com/office/drawing/2016/5/10/chartex" xmlns:cx5="http://schemas.microsoft.com/office/drawing/2016/5/11/chartex" xmlns:cx6="http://schemas.microsoft.com/office/drawing/2016/5/12/chartex" xmlns:cx7="http://schemas.microsoft.com/office/drawing/2016/5/13/chartex" xmlns:cx8="http://schemas.microsoft.com/office/drawing/2016/5/14/chartex" xmlns:mc="http://schemas.openxmlformats.org/markup-compatibility/2006" xmlns:aink="http://schemas.microsoft.com/office/drawing/2016/ink" xmlns:am3d="http://schemas.microsoft.com/office/drawing/2017/model3d" xmlns:o="urn:schemas-microsoft-com:office:office" xmlns:oel="http://schemas.microsoft.com/office/2019/extlst" xmlns:r="http://schemas.openxmlformats.org/officeDocument/2006/relationships" xmlns:m="http://schemas.openxmlformats.org/officeDocument/2006/math" xmlns:v="urn:schemas-microsoft-com:vml" xmlns:wp14="http://schemas.microsoft.com/office/word/2010/wordprocessingDrawing" xmlns:wp="http://schemas.openxmlformats.org/drawingml/2006/wordprocessingDrawing" xmlns:w10="urn:schemas-microsoft-com:office:word" xmlns:w="http://schemas.openxmlformats.org/wordprocessingml/2006/main" xmlns:w14="http://schemas.microsoft.com/office/word/2010/wordml" xmlns:w15="http://schemas.microsoft.com/office/word/2012/wordml" xmlns:w16cex="http://schemas.microsoft.com/office/word/2018/wordml/cex" xmlns:w16cid="http://schemas.microsoft.com/office/word/2016/wordml/cid" xmlns:w16="http://schemas.microsoft.com/office/word/2018/wordml" xmlns:w16du="http://schemas.microsoft.com/office/word/2023/wordml/word16du" xmlns:w16sdtdh="http://schemas.microsoft.com/office/word/2020/wordml/sdtdatahash" xmlns:w16sdtfl="http://schemas.microsoft.com/office/word/2024/wordml/sdtformatlock" xmlns:w16se="http://schemas.microsoft.com/office/word/2015/wordml/symex" xmlns:wpg="http://schemas.microsoft.com/office/word/2010/wordprocessingGroup" xmlns:wpi="http://schemas.microsoft.com/office/word/2010/wordprocessingInk" xmlns:wne="http://schemas.microsoft.com/office/word/2006/wordml" xmlns:wps="http://schemas.microsoft.com/office/word/2010/wordprocessingShape" mc:Ignorable="w14 w15 w16se w16cid w16 w16cex w16sdtdh w16sdtfl w16du wp14">
+  <w:abstractNum w:abstractNumId="0" w15:restartNumberingAfterBreak="0">
+    <w:nsid w:val="45B44C82"/>
+    <w:multiLevelType w:val="multilevel"/>
+    <w:tmpl w:val="DDA0CC78"/>
+    <w:lvl w:ilvl="0">
+      <w:start w:val="1"/>
+      <w:numFmt w:val="bullet"/>
+      <w:lvlText w:val=""/>
+      <w:lvlJc w:val="left"/>
+      <w:pPr>
+        <w:tabs>
+          <w:tab w:val="num" w:pos="720"/>
+        </w:tabs>
+        <w:ind w:left="720" w:hanging="360"/>
+      </w:pPr>
+      <w:rPr>
+        <w:rFonts w:ascii="Symbol" w:hAnsi="Symbol" w:hint="default"/>
+        <w:sz w:val="20"/>
+      </w:rPr>
+    </w:lvl>
+    <w:lvl w:ilvl="1" w:tentative="1">
+      <w:start w:val="1"/>
+      <w:numFmt w:val="bullet"/>
+      <w:lvlText w:val="o"/>
+      <w:lvlJc w:val="left"/>
+      <w:pPr>
+        <w:tabs>
+          <w:tab w:val="num" w:pos="1440"/>
+        </w:tabs>
+        <w:ind w:left="1440" w:hanging="360"/>
+      </w:pPr>
+      <w:rPr>
+        <w:rFonts w:ascii="Courier New" w:hAnsi="Courier New" w:hint="default"/>
+        <w:sz w:val="20"/>
+      </w:rPr>
+    </w:lvl>
+    <w:lvl w:ilvl="2" w:tentative="1">
+      <w:start w:val="1"/>
+      <w:numFmt w:val="bullet"/>
+      <w:lvlText w:val=""/>
+      <w:lvlJc w:val="left"/>
+      <w:pPr>
+        <w:tabs>
+          <w:tab w:val="num" w:pos="2160"/>
+        </w:tabs>
+        <w:ind w:left="2160" w:hanging="360"/>
+      </w:pPr>
+      <w:rPr>
+        <w:rFonts w:ascii="Wingdings" w:hAnsi="Wingdings" w:hint="default"/>
+        <w:sz w:val="20"/>
+      </w:rPr>
+    </w:lvl>
+    <w:lvl w:ilvl="3" w:tentative="1">
+      <w:start w:val="1"/>
+      <w:numFmt w:val="bullet"/>
+      <w:lvlText w:val=""/>
+      <w:lvlJc w:val="left"/>
+      <w:pPr>
+        <w:tabs>
+          <w:tab w:val="num" w:pos="2880"/>
+        </w:tabs>
+        <w:ind w:left="2880" w:hanging="360"/>
+      </w:pPr>
+      <w:rPr>
+        <w:rFonts w:ascii="Wingdings" w:hAnsi="Wingdings" w:hint="default"/>
+        <w:sz w:val="20"/>
+      </w:rPr>
+    </w:lvl>
+    <w:lvl w:ilvl="4" w:tentative="1">
+      <w:start w:val="1"/>
+      <w:numFmt w:val="bullet"/>
+      <w:lvlText w:val=""/>
+      <w:lvlJc w:val="left"/>
+      <w:pPr>
+        <w:tabs>
+          <w:tab w:val="num" w:pos="3600"/>
+        </w:tabs>
+        <w:ind w:left="3600" w:hanging="360"/>
+      </w:pPr>
+      <w:rPr>
+        <w:rFonts w:ascii="Wingdings" w:hAnsi="Wingdings" w:hint="default"/>
+        <w:sz w:val="20"/>
+      </w:rPr>
+    </w:lvl>
+    <w:lvl w:ilvl="5" w:tentative="1">
+      <w:start w:val="1"/>
+      <w:numFmt w:val="bullet"/>
+      <w:lvlText w:val=""/>
+      <w:lvlJc w:val="left"/>
+      <w:pPr>
+        <w:tabs>
+          <w:tab w:val="num" w:pos="4320"/>
+        </w:tabs>
+        <w:ind w:left="4320" w:hanging="360"/>
+      </w:pPr>
+      <w:rPr>
+        <w:rFonts w:ascii="Wingdings" w:hAnsi="Wingdings" w:hint="default"/>
+        <w:sz w:val="20"/>
+      </w:rPr>
+    </w:lvl>
+    <w:lvl w:ilvl="6" w:tentative="1">
+      <w:start w:val="1"/>
+      <w:numFmt w:val="bullet"/>
+      <w:lvlText w:val=""/>
+      <w:lvlJc w:val="left"/>
+      <w:pPr>
+        <w:tabs>
+          <w:tab w:val="num" w:pos="5040"/>
+        </w:tabs>
+        <w:ind w:left="5040" w:hanging="360"/>
+      </w:pPr>
+      <w:rPr>
+        <w:rFonts w:ascii="Wingdings" w:hAnsi="Wingdings" w:hint="default"/>
+        <w:sz w:val="20"/>
+      </w:rPr>
+    </w:lvl>
+    <w:lvl w:ilvl="7" w:tentative="1">
+      <w:start w:val="1"/>
+      <w:numFmt w:val="bullet"/>
+      <w:lvlText w:val=""/>
+      <w:lvlJc w:val="left"/>
+      <w:pPr>
+        <w:tabs>
+          <w:tab w:val="num" w:pos="5760"/>
+        </w:tabs>
+        <w:ind w:left="5760" w:hanging="360"/>
+      </w:pPr>
+      <w:rPr>
+        <w:rFonts w:ascii="Wingdings" w:hAnsi="Wingdings" w:hint="default"/>
+        <w:sz w:val="20"/>
+      </w:rPr>
+    </w:lvl>
+    <w:lvl w:ilvl="8" w:tentative="1">
+      <w:start w:val="1"/>
+      <w:numFmt w:val="bullet"/>
+      <w:lvlText w:val=""/>
+      <w:lvlJc w:val="left"/>
+      <w:pPr>
+        <w:tabs>
+          <w:tab w:val="num" w:pos="6480"/>
+        </w:tabs>
+        <w:ind w:left="6480" w:hanging="360"/>
+      </w:pPr>
+      <w:rPr>
+        <w:rFonts w:ascii="Wingdings" w:hAnsi="Wingdings" w:hint="default"/>
+        <w:sz w:val="20"/>
+      </w:rPr>
+    </w:lvl>
+  </w:abstractNum>
+  <w:num w:numId="1" w16cid:durableId="1289357943">
+    <w:abstractNumId w:val="0"/>
+  </w:num>
+</w:numbering>
 </file>
 
 <file path=word/styles.xml><?xml version="1.0" encoding="utf-8"?>
@@ -1453,7 +2390,6 @@
   <w:style w:type="character" w:default="1" w:styleId="Fuentedeprrafopredeter">
     <w:name w:val="Default Paragraph Font"/>
     <w:uiPriority w:val="1"/>
-    <w:semiHidden/>
     <w:unhideWhenUsed/>
   </w:style>
   <w:style w:type="table" w:default="1" w:styleId="Tablanormal">

</xml_diff>

<commit_message>
[docs] Se agrega imagen del historial de commits
</commit_message>
<xml_diff>
--- a/Practica2_IntroIngSoft.docx
+++ b/Practica2_IntroIngSoft.docx
@@ -127,19 +127,8 @@
           <w:sz w:val="24"/>
           <w:szCs w:val="24"/>
         </w:rPr>
-        <w:t xml:space="preserve">Control de versiones con </w:t>
-      </w:r>
-      <w:proofErr w:type="spellStart"/>
-      <w:r>
-        <w:rPr>
-          <w:b w:val="0"/>
-          <w:bCs w:val="0"/>
-          <w:sz w:val="24"/>
-          <w:szCs w:val="24"/>
-        </w:rPr>
-        <w:t>github</w:t>
-      </w:r>
-      <w:proofErr w:type="spellEnd"/>
+        <w:t>Control de versiones con github</w:t>
+      </w:r>
     </w:p>
     <w:p>
       <w:pPr>
@@ -291,19 +280,8 @@
           <w:sz w:val="24"/>
           <w:szCs w:val="24"/>
         </w:rPr>
-        <w:t xml:space="preserve">13 </w:t>
-      </w:r>
-      <w:proofErr w:type="gramStart"/>
-      <w:r>
-        <w:rPr>
-          <w:b w:val="0"/>
-          <w:bCs w:val="0"/>
-          <w:sz w:val="24"/>
-          <w:szCs w:val="24"/>
-        </w:rPr>
-        <w:t>Abr</w:t>
-      </w:r>
-      <w:proofErr w:type="gramEnd"/>
+        <w:t>13 Abr</w:t>
+      </w:r>
       <w:r>
         <w:rPr>
           <w:b w:val="0"/>
@@ -397,17 +375,8 @@
           <w:sz w:val="24"/>
           <w:szCs w:val="24"/>
         </w:rPr>
-        <w:t xml:space="preserve">Taller </w:t>
-      </w:r>
-      <w:proofErr w:type="spellStart"/>
-      <w:r>
-        <w:rPr>
-          <w:sz w:val="24"/>
-          <w:szCs w:val="24"/>
-        </w:rPr>
-        <w:t>Github</w:t>
-      </w:r>
-      <w:proofErr w:type="spellEnd"/>
+        <w:t>Taller Github</w:t>
+      </w:r>
     </w:p>
     <w:p>
       <w:pPr>
@@ -630,19 +599,8 @@
           <w:szCs w:val="24"/>
         </w:rPr>
         <w:lastRenderedPageBreak/>
-        <w:t xml:space="preserve">Primer </w:t>
-      </w:r>
-      <w:proofErr w:type="spellStart"/>
-      <w:r>
-        <w:rPr>
-          <w:i/>
-          <w:iCs/>
-          <w:sz w:val="24"/>
-          <w:szCs w:val="24"/>
-        </w:rPr>
-        <w:t>commit</w:t>
-      </w:r>
-      <w:proofErr w:type="spellEnd"/>
+        <w:t>Primer commit</w:t>
+      </w:r>
     </w:p>
     <w:p>
       <w:pPr>
@@ -847,27 +805,7 @@
           <w:szCs w:val="24"/>
         </w:rPr>
         <w:lastRenderedPageBreak/>
-        <w:t xml:space="preserve">Segundo </w:t>
-      </w:r>
-      <w:proofErr w:type="spellStart"/>
-      <w:r>
-        <w:rPr>
-          <w:i/>
-          <w:iCs/>
-          <w:sz w:val="24"/>
-          <w:szCs w:val="24"/>
-        </w:rPr>
-        <w:t>commit</w:t>
-      </w:r>
-      <w:proofErr w:type="spellEnd"/>
-      <w:r>
-        <w:rPr>
-          <w:i/>
-          <w:iCs/>
-          <w:sz w:val="24"/>
-          <w:szCs w:val="24"/>
-        </w:rPr>
-        <w:t xml:space="preserve"> </w:t>
+        <w:t xml:space="preserve">Segundo commit </w:t>
       </w:r>
     </w:p>
     <w:p>
@@ -1056,19 +994,8 @@
           <w:sz w:val="24"/>
           <w:szCs w:val="24"/>
         </w:rPr>
-        <w:t xml:space="preserve">Tercer </w:t>
-      </w:r>
-      <w:proofErr w:type="spellStart"/>
-      <w:r>
-        <w:rPr>
-          <w:i/>
-          <w:iCs/>
-          <w:sz w:val="24"/>
-          <w:szCs w:val="24"/>
-        </w:rPr>
-        <w:t>commit</w:t>
-      </w:r>
-      <w:proofErr w:type="spellEnd"/>
+        <w:t>Tercer commit</w:t>
+      </w:r>
     </w:p>
     <w:p>
       <w:pPr>
@@ -1145,216 +1072,162 @@
           <w:szCs w:val="24"/>
         </w:rPr>
       </w:pPr>
-    </w:p>
-    <w:p>
-      <w:pPr>
-        <w:pStyle w:val="h1"/>
-        <w:spacing w:line="480" w:lineRule="auto"/>
-        <w:jc w:val="left"/>
-        <w:rPr>
-          <w:i/>
-          <w:iCs/>
-          <w:sz w:val="24"/>
-          <w:szCs w:val="24"/>
-        </w:rPr>
-      </w:pPr>
-    </w:p>
-    <w:p>
-      <w:pPr>
-        <w:pStyle w:val="h1"/>
-        <w:spacing w:line="480" w:lineRule="auto"/>
-        <w:jc w:val="left"/>
-        <w:rPr>
-          <w:i/>
-          <w:iCs/>
-          <w:sz w:val="24"/>
-          <w:szCs w:val="24"/>
-        </w:rPr>
-      </w:pPr>
-    </w:p>
-    <w:p>
-      <w:pPr>
-        <w:pStyle w:val="h1"/>
-        <w:spacing w:line="480" w:lineRule="auto"/>
-        <w:jc w:val="left"/>
-        <w:rPr>
-          <w:i/>
-          <w:iCs/>
-          <w:sz w:val="24"/>
-          <w:szCs w:val="24"/>
-        </w:rPr>
-      </w:pPr>
-    </w:p>
-    <w:p>
-      <w:pPr>
-        <w:pStyle w:val="h1"/>
-        <w:spacing w:line="480" w:lineRule="auto"/>
-        <w:jc w:val="left"/>
-        <w:rPr>
-          <w:i/>
-          <w:iCs/>
-          <w:sz w:val="24"/>
-          <w:szCs w:val="24"/>
-        </w:rPr>
-      </w:pPr>
-    </w:p>
-    <w:p>
-      <w:pPr>
-        <w:pStyle w:val="h1"/>
-        <w:spacing w:line="480" w:lineRule="auto"/>
-        <w:jc w:val="left"/>
-        <w:rPr>
-          <w:i/>
-          <w:iCs/>
-          <w:sz w:val="24"/>
-          <w:szCs w:val="24"/>
-        </w:rPr>
-      </w:pPr>
-    </w:p>
-    <w:p>
-      <w:pPr>
-        <w:pStyle w:val="h1"/>
-        <w:spacing w:line="480" w:lineRule="auto"/>
-        <w:jc w:val="left"/>
-        <w:rPr>
-          <w:i/>
-          <w:iCs/>
-          <w:sz w:val="24"/>
-          <w:szCs w:val="24"/>
-        </w:rPr>
-      </w:pPr>
-    </w:p>
-    <w:p>
-      <w:pPr>
-        <w:pStyle w:val="h1"/>
-        <w:spacing w:line="480" w:lineRule="auto"/>
-        <w:jc w:val="left"/>
-        <w:rPr>
-          <w:i/>
-          <w:iCs/>
-          <w:sz w:val="24"/>
-          <w:szCs w:val="24"/>
-        </w:rPr>
-      </w:pPr>
-    </w:p>
-    <w:p>
-      <w:pPr>
-        <w:pStyle w:val="h1"/>
-        <w:spacing w:line="480" w:lineRule="auto"/>
-        <w:jc w:val="left"/>
-        <w:rPr>
-          <w:i/>
-          <w:iCs/>
-          <w:sz w:val="24"/>
-          <w:szCs w:val="24"/>
-        </w:rPr>
-      </w:pPr>
-    </w:p>
-    <w:p>
-      <w:pPr>
-        <w:pStyle w:val="h1"/>
-        <w:spacing w:line="480" w:lineRule="auto"/>
-        <w:jc w:val="left"/>
-        <w:rPr>
-          <w:i/>
-          <w:iCs/>
-          <w:sz w:val="24"/>
-          <w:szCs w:val="24"/>
-        </w:rPr>
-      </w:pPr>
-    </w:p>
-    <w:p>
-      <w:pPr>
-        <w:pStyle w:val="h1"/>
-        <w:spacing w:line="480" w:lineRule="auto"/>
-        <w:jc w:val="left"/>
-        <w:rPr>
-          <w:i/>
-          <w:iCs/>
-          <w:sz w:val="24"/>
-          <w:szCs w:val="24"/>
-        </w:rPr>
-      </w:pPr>
-    </w:p>
-    <w:p>
-      <w:pPr>
-        <w:pStyle w:val="h1"/>
-        <w:spacing w:line="480" w:lineRule="auto"/>
-        <w:jc w:val="left"/>
-        <w:rPr>
-          <w:i/>
-          <w:iCs/>
-          <w:sz w:val="24"/>
-          <w:szCs w:val="24"/>
-        </w:rPr>
-      </w:pPr>
-    </w:p>
-    <w:p>
-      <w:pPr>
-        <w:pStyle w:val="h1"/>
-        <w:spacing w:line="480" w:lineRule="auto"/>
-        <w:jc w:val="left"/>
-        <w:rPr>
-          <w:i/>
-          <w:iCs/>
-          <w:sz w:val="24"/>
-          <w:szCs w:val="24"/>
-        </w:rPr>
-      </w:pPr>
-    </w:p>
-    <w:p>
-      <w:pPr>
-        <w:pStyle w:val="h1"/>
-        <w:spacing w:line="480" w:lineRule="auto"/>
-        <w:jc w:val="left"/>
-        <w:rPr>
-          <w:i/>
-          <w:iCs/>
-          <w:sz w:val="24"/>
-          <w:szCs w:val="24"/>
-        </w:rPr>
-      </w:pPr>
-    </w:p>
-    <w:p>
-      <w:pPr>
-        <w:pStyle w:val="h1"/>
-        <w:spacing w:line="480" w:lineRule="auto"/>
-        <w:jc w:val="left"/>
-        <w:rPr>
-          <w:i/>
-          <w:iCs/>
-          <w:sz w:val="24"/>
-          <w:szCs w:val="24"/>
-        </w:rPr>
-      </w:pPr>
-    </w:p>
-    <w:p>
-      <w:pPr>
-        <w:pStyle w:val="h1"/>
-        <w:spacing w:line="480" w:lineRule="auto"/>
-        <w:jc w:val="left"/>
-        <w:rPr>
-          <w:i/>
-          <w:iCs/>
-          <w:sz w:val="24"/>
-          <w:szCs w:val="24"/>
-        </w:rPr>
-      </w:pPr>
-    </w:p>
-    <w:p>
-      <w:pPr>
-        <w:pStyle w:val="h1"/>
-        <w:spacing w:line="480" w:lineRule="auto"/>
-        <w:rPr>
-          <w:sz w:val="24"/>
-          <w:szCs w:val="24"/>
-        </w:rPr>
-      </w:pPr>
-      <w:r>
-        <w:rPr>
-          <w:sz w:val="24"/>
-          <w:szCs w:val="24"/>
-        </w:rPr>
+      <w:r>
+        <w:rPr>
+          <w:i/>
+          <w:iCs/>
+          <w:sz w:val="24"/>
+          <w:szCs w:val="24"/>
+        </w:rPr>
+        <w:lastRenderedPageBreak/>
+        <w:t>Historial de commit</w:t>
+      </w:r>
+      <w:r>
+        <w:rPr>
+          <w:i/>
+          <w:iCs/>
+          <w:sz w:val="24"/>
+          <w:szCs w:val="24"/>
+        </w:rPr>
+        <w:t>s</w:t>
+      </w:r>
+    </w:p>
+    <w:p>
+      <w:pPr>
+        <w:pStyle w:val="h1"/>
+        <w:spacing w:line="480" w:lineRule="auto"/>
+        <w:jc w:val="left"/>
+        <w:rPr>
+          <w:i/>
+          <w:iCs/>
+          <w:sz w:val="24"/>
+          <w:szCs w:val="24"/>
+        </w:rPr>
+      </w:pPr>
+      <w:r>
+        <w:rPr>
+          <w:i/>
+          <w:iCs/>
+          <w:sz w:val="24"/>
+          <w:szCs w:val="24"/>
+        </w:rPr>
+        <w:drawing>
+          <wp:inline distT="0" distB="0" distL="0" distR="0" wp14:anchorId="6078678E" wp14:editId="06FC2FA2">
+            <wp:extent cx="5335325" cy="5860111"/>
+            <wp:effectExtent l="0" t="0" r="0" b="7620"/>
+            <wp:docPr id="1299527545" name="Imagen 1"/>
+            <wp:cNvGraphicFramePr>
+              <a:graphicFrameLocks xmlns:a="http://schemas.openxmlformats.org/drawingml/2006/main" noChangeAspect="1"/>
+            </wp:cNvGraphicFramePr>
+            <a:graphic xmlns:a="http://schemas.openxmlformats.org/drawingml/2006/main">
+              <a:graphicData uri="http://schemas.openxmlformats.org/drawingml/2006/picture">
+                <pic:pic xmlns:pic="http://schemas.openxmlformats.org/drawingml/2006/picture">
+                  <pic:nvPicPr>
+                    <pic:cNvPr id="1299527545" name=""/>
+                    <pic:cNvPicPr/>
+                  </pic:nvPicPr>
+                  <pic:blipFill>
+                    <a:blip r:embed="rId13"/>
+                    <a:stretch>
+                      <a:fillRect/>
+                    </a:stretch>
+                  </pic:blipFill>
+                  <pic:spPr>
+                    <a:xfrm>
+                      <a:off x="0" y="0"/>
+                      <a:ext cx="5347537" cy="5873524"/>
+                    </a:xfrm>
+                    <a:prstGeom prst="rect">
+                      <a:avLst/>
+                    </a:prstGeom>
+                  </pic:spPr>
+                </pic:pic>
+              </a:graphicData>
+            </a:graphic>
+          </wp:inline>
+        </w:drawing>
+      </w:r>
+    </w:p>
+    <w:p>
+      <w:pPr>
+        <w:pStyle w:val="h1"/>
+        <w:spacing w:line="480" w:lineRule="auto"/>
+        <w:jc w:val="left"/>
+        <w:rPr>
+          <w:i/>
+          <w:iCs/>
+          <w:sz w:val="24"/>
+          <w:szCs w:val="24"/>
+        </w:rPr>
+      </w:pPr>
+    </w:p>
+    <w:p>
+      <w:pPr>
+        <w:pStyle w:val="h1"/>
+        <w:spacing w:line="480" w:lineRule="auto"/>
+        <w:jc w:val="left"/>
+        <w:rPr>
+          <w:i/>
+          <w:iCs/>
+          <w:sz w:val="24"/>
+          <w:szCs w:val="24"/>
+        </w:rPr>
+      </w:pPr>
+    </w:p>
+    <w:p>
+      <w:pPr>
+        <w:pStyle w:val="h1"/>
+        <w:spacing w:line="480" w:lineRule="auto"/>
+        <w:jc w:val="left"/>
+        <w:rPr>
+          <w:i/>
+          <w:iCs/>
+          <w:sz w:val="24"/>
+          <w:szCs w:val="24"/>
+        </w:rPr>
+      </w:pPr>
+    </w:p>
+    <w:p>
+      <w:pPr>
+        <w:pStyle w:val="h1"/>
+        <w:spacing w:line="480" w:lineRule="auto"/>
+        <w:jc w:val="left"/>
+        <w:rPr>
+          <w:i/>
+          <w:iCs/>
+          <w:sz w:val="24"/>
+          <w:szCs w:val="24"/>
+        </w:rPr>
+      </w:pPr>
+    </w:p>
+    <w:p>
+      <w:pPr>
+        <w:pStyle w:val="h1"/>
+        <w:spacing w:line="480" w:lineRule="auto"/>
+        <w:jc w:val="left"/>
+        <w:rPr>
+          <w:i/>
+          <w:iCs/>
+          <w:sz w:val="24"/>
+          <w:szCs w:val="24"/>
+        </w:rPr>
+      </w:pPr>
+    </w:p>
+    <w:p>
+      <w:pPr>
+        <w:pStyle w:val="h1"/>
+        <w:spacing w:line="480" w:lineRule="auto"/>
+        <w:rPr>
+          <w:sz w:val="24"/>
+          <w:szCs w:val="24"/>
+        </w:rPr>
+      </w:pPr>
+      <w:r>
+        <w:rPr>
+          <w:sz w:val="24"/>
+          <w:szCs w:val="24"/>
+        </w:rPr>
+        <w:lastRenderedPageBreak/>
         <w:t>Conclusiones</w:t>
       </w:r>
     </w:p>
@@ -1374,47 +1247,7 @@
           <w:b w:val="0"/>
           <w:bCs w:val="0"/>
         </w:rPr>
-        <w:t>La realización de esta práctica permitió aplicar de manera integral los fundamentos del control de versiones utilizando Git y GitHub Desktop. A través del ejercicio, se logró estructurar un flujo de trabajo basado en ramas (</w:t>
-      </w:r>
-      <w:proofErr w:type="spellStart"/>
-      <w:r>
-        <w:rPr>
-          <w:b w:val="0"/>
-          <w:bCs w:val="0"/>
-        </w:rPr>
-        <w:t>branches</w:t>
-      </w:r>
-      <w:proofErr w:type="spellEnd"/>
-      <w:r>
-        <w:rPr>
-          <w:b w:val="0"/>
-          <w:bCs w:val="0"/>
-        </w:rPr>
-        <w:t xml:space="preserve">), donde cada etapa del documento (introducción, desarrollo y conclusión) fue tratada como un módulo independiente. Este proceso facilitó la comprensión de la </w:t>
-      </w:r>
-      <w:r>
-        <w:rPr>
-          <w:b w:val="0"/>
-          <w:bCs w:val="0"/>
-        </w:rPr>
-        <w:lastRenderedPageBreak/>
-        <w:t xml:space="preserve">importancia de los </w:t>
-      </w:r>
-      <w:proofErr w:type="spellStart"/>
-      <w:r>
-        <w:rPr>
-          <w:b w:val="0"/>
-          <w:bCs w:val="0"/>
-        </w:rPr>
-        <w:t>commits</w:t>
-      </w:r>
-      <w:proofErr w:type="spellEnd"/>
-      <w:r>
-        <w:rPr>
-          <w:b w:val="0"/>
-          <w:bCs w:val="0"/>
-        </w:rPr>
-        <w:t xml:space="preserve"> como puntos de restauración y registro histórico, permitiendo que el proyecto evolucionara de forma organizada y segura.</w:t>
+        <w:t>La realización de esta práctica permitió aplicar de manera integral los fundamentos del control de versiones utilizando Git y GitHub Desktop. A través del ejercicio, se logró estructurar un flujo de trabajo basado en ramas (branches), donde cada etapa del documento (introducción, desarrollo y conclusión) fue tratada como un módulo independiente. Este proceso facilitó la comprensión de la importancia de los commits como puntos de restauración y registro histórico, permitiendo que el proyecto evolucionara de forma organizada y segura.</w:t>
       </w:r>
     </w:p>
     <w:p>
@@ -1454,23 +1287,7 @@
           <w:b w:val="0"/>
           <w:bCs w:val="0"/>
         </w:rPr>
-        <w:t xml:space="preserve">Gestión de Cambios: Se comprendió que el </w:t>
-      </w:r>
-      <w:proofErr w:type="spellStart"/>
-      <w:r>
-        <w:rPr>
-          <w:b w:val="0"/>
-          <w:bCs w:val="0"/>
-        </w:rPr>
-        <w:t>commit</w:t>
-      </w:r>
-      <w:proofErr w:type="spellEnd"/>
-      <w:r>
-        <w:rPr>
-          <w:b w:val="0"/>
-          <w:bCs w:val="0"/>
-        </w:rPr>
-        <w:t xml:space="preserve"> es la unidad básica de guardado en Git y que es fundamental para evitar conflictos al saltar entre diferentes versiones de un mismo archivo.</w:t>
+        <w:t>Gestión de Cambios: Se comprendió que el commit es la unidad básica de guardado en Git y que es fundamental para evitar conflictos al saltar entre diferentes versiones de un mismo archivo.</w:t>
       </w:r>
     </w:p>
     <w:p>
@@ -1492,23 +1309,7 @@
           <w:b w:val="0"/>
           <w:bCs w:val="0"/>
         </w:rPr>
-        <w:t>Estructura de Ramas: Se aprendió a utilizar una estrategia de ramificación para separar tareas específicas, lo cual permite trabajar en nuevas funcionalidades (o secciones de un informe) sin alterar la rama principal (</w:t>
-      </w:r>
-      <w:proofErr w:type="spellStart"/>
-      <w:r>
-        <w:rPr>
-          <w:b w:val="0"/>
-          <w:bCs w:val="0"/>
-        </w:rPr>
-        <w:t>main</w:t>
-      </w:r>
-      <w:proofErr w:type="spellEnd"/>
-      <w:r>
-        <w:rPr>
-          <w:b w:val="0"/>
-          <w:bCs w:val="0"/>
-        </w:rPr>
-        <w:t>) hasta que el contenido esté finalizado y verificado.</w:t>
+        <w:t>Estructura de Ramas: Se aprendió a utilizar una estrategia de ramificación para separar tareas específicas, lo cual permite trabajar en nuevas funcionalidades (o secciones de un informe) sin alterar la rama principal (main) hasta que el contenido esté finalizado y verificado.</w:t>
       </w:r>
     </w:p>
     <w:p>
@@ -1530,23 +1331,7 @@
           <w:b w:val="0"/>
           <w:bCs w:val="0"/>
         </w:rPr>
-        <w:t>Integración (</w:t>
-      </w:r>
-      <w:proofErr w:type="spellStart"/>
-      <w:r>
-        <w:rPr>
-          <w:b w:val="0"/>
-          <w:bCs w:val="0"/>
-        </w:rPr>
-        <w:t>Merge</w:t>
-      </w:r>
-      <w:proofErr w:type="spellEnd"/>
-      <w:r>
-        <w:rPr>
-          <w:b w:val="0"/>
-          <w:bCs w:val="0"/>
-        </w:rPr>
-        <w:t>): Se dominó el proceso de fusión de ramas, entendiendo cómo Git consolida el trabajo realizado de forma aislada en un producto final unificado.</w:t>
+        <w:t>Integración (Merge): Se dominó el proceso de fusión de ramas, entendiendo cómo Git consolida el trabajo realizado de forma aislada en un producto final unificado.</w:t>
       </w:r>
     </w:p>
     <w:p>
@@ -1565,7 +1350,7 @@
           <w:b w:val="0"/>
           <w:bCs w:val="0"/>
         </w:rPr>
-        <w:t>En el ámbito de la Ingeniería de Software, el dominio de estas herramientas es una competencia indispensable. El control de versiones no solo garantiza la trazabilidad (saber quién, cuándo y por qué se hizo un cambio), sino que es la base del trabajo colaborativo a gran escala. En un entorno profesional, el uso correcto de ramas permite que múltiples desarrolladores trabajen en distintas partes de un sistema simultáneamente sin interferir entre sí, facilitando la implementación de metodologías ágiles y procesos de integración continua (CI/CD) que aseguran la calidad y estabilidad del software entregado.</w:t>
+        <w:t>En el ámbito de la Ingeniería de Software, el dominio de estas herramientas es una competencia indispensable. El control de versiones no solo garantiza la trazabilidad (saber quién, cuándo y por qué se hizo un cambio), sino que es la base del trabajo colaborativo a gran escala. En un entorno profesional, el uso correcto de ramas permite que múltiples desarrolladores trabajen en distintas partes de un sistema simultáneamente sin interferir entre sí, facilitando la implementación de metodologías ágiles y procesos de integración continua que aseguran la calidad y estabilidad del software entregado.</w:t>
       </w:r>
     </w:p>
     <w:p>

</xml_diff>